<commit_message>
Updated word file for quick review over the project
</commit_message>
<xml_diff>
--- a/SPRING.SECURITY.docx
+++ b/SPRING.SECURITY.docx
@@ -2147,46 +2147,14 @@
           <w:bCs/>
           <w:color w:val="000000" w:themeColor="text1"/>
         </w:rPr>
-        <w:t xml:space="preserve">These different types of </w:t>
-      </w:r>
-      <w:proofErr w:type="spellStart"/>
-      <w:r>
-        <w:rPr>
-          <w:bCs/>
-          <w:color w:val="000000" w:themeColor="text1"/>
-        </w:rPr>
-        <w:t>AuthenticationProviders</w:t>
-      </w:r>
-      <w:proofErr w:type="spellEnd"/>
-      <w:r>
-        <w:rPr>
-          <w:bCs/>
-          <w:color w:val="000000" w:themeColor="text1"/>
-        </w:rPr>
-        <w:t xml:space="preserve"> are managed by other </w:t>
-      </w:r>
-      <w:r>
-        <w:rPr>
-          <w:bCs/>
-          <w:color w:val="000000" w:themeColor="text1"/>
-        </w:rPr>
-        <w:t xml:space="preserve">Object and it redirects request to different </w:t>
-      </w:r>
-      <w:proofErr w:type="spellStart"/>
-      <w:r>
-        <w:rPr>
-          <w:bCs/>
-          <w:color w:val="000000" w:themeColor="text1"/>
-        </w:rPr>
-        <w:t>AuthenticationProviders</w:t>
-      </w:r>
-      <w:proofErr w:type="spellEnd"/>
-      <w:r>
-        <w:rPr>
-          <w:bCs/>
-          <w:color w:val="000000" w:themeColor="text1"/>
-        </w:rPr>
-        <w:t xml:space="preserve"> </w:t>
+        <w:t xml:space="preserve">These different types of AuthenticationProviders are managed by other </w:t>
+      </w:r>
+      <w:r>
+        <w:rPr>
+          <w:bCs/>
+          <w:color w:val="000000" w:themeColor="text1"/>
+        </w:rPr>
+        <w:t xml:space="preserve">Object and it redirects request to different AuthenticationProviders </w:t>
       </w:r>
       <w:r>
         <w:rPr>
@@ -2329,23 +2297,7 @@
           <w:bCs/>
           <w:color w:val="000000" w:themeColor="text1"/>
         </w:rPr>
-        <w:t xml:space="preserve"> utilizes this methos and checks all the </w:t>
-      </w:r>
-      <w:proofErr w:type="spellStart"/>
-      <w:r>
-        <w:rPr>
-          <w:bCs/>
-          <w:color w:val="000000" w:themeColor="text1"/>
-        </w:rPr>
-        <w:t>AuthenticationProviders</w:t>
-      </w:r>
-      <w:proofErr w:type="spellEnd"/>
-      <w:r>
-        <w:rPr>
-          <w:bCs/>
-          <w:color w:val="000000" w:themeColor="text1"/>
-        </w:rPr>
-        <w:t xml:space="preserve"> to check whether the particular type of authentication is supported by that </w:t>
+        <w:t xml:space="preserve"> utilizes this methos and checks all the AuthenticationProviders to check whether the particular type of authentication is supported by that </w:t>
       </w:r>
       <w:proofErr w:type="spellStart"/>
       <w:r>
@@ -3224,7 +3176,21 @@
             <w:rStyle w:val="Hyperlink"/>
             <w:bCs/>
           </w:rPr>
-          <w:t>https://medium.com/swlh/why-do-we-need-the-json-web-token-jwt-in-the-modern-web-8490a7284482</w:t>
+          <w:t>https://medium.com/swlh/why-do-we-need-the-jso</w:t>
+        </w:r>
+        <w:r>
+          <w:rPr>
+            <w:rStyle w:val="Hyperlink"/>
+            <w:bCs/>
+          </w:rPr>
+          <w:t>n</w:t>
+        </w:r>
+        <w:r>
+          <w:rPr>
+            <w:rStyle w:val="Hyperlink"/>
+            <w:bCs/>
+          </w:rPr>
+          <w:t>-web-token-jwt-in-the-modern-web-8490a7284482</w:t>
         </w:r>
       </w:hyperlink>
     </w:p>
@@ -3626,6 +3592,7 @@
       <w:r>
         <w:rPr>
           <w:rFonts w:ascii="Georgia" w:eastAsia="Times New Roman" w:hAnsi="Georgia" w:cs="Times New Roman"/>
+          <w:noProof/>
           <w:color w:val="292929"/>
           <w:spacing w:val="-1"/>
           <w:sz w:val="30"/>
@@ -3719,6 +3686,7 @@
       <w:r>
         <w:rPr>
           <w:rFonts w:ascii="Georgia" w:eastAsia="Times New Roman" w:hAnsi="Georgia" w:cs="Times New Roman"/>
+          <w:noProof/>
           <w:color w:val="292929"/>
           <w:spacing w:val="-1"/>
           <w:sz w:val="30"/>
@@ -4649,15 +4617,7 @@
       </w:r>
       <w:proofErr w:type="gramEnd"/>
       <w:r>
-        <w:t xml:space="preserve"> the </w:t>
-      </w:r>
-      <w:proofErr w:type="gramStart"/>
-      <w:r>
-        <w:t>servers</w:t>
-      </w:r>
-      <w:proofErr w:type="gramEnd"/>
-      <w:r>
-        <w:t xml:space="preserve"> hand out a token to client and ask the client to bring that token along with an </w:t>
+        <w:t xml:space="preserve"> the servers hand out a token to client and ask the client to bring that token along with an </w:t>
       </w:r>
       <w:proofErr w:type="spellStart"/>
       <w:r>
@@ -5272,43 +5232,180 @@
             <w:bCs/>
             <w:u w:val="none"/>
           </w:rPr>
-          <w:t>https://developer.okta.com/blog/201</w:t>
-        </w:r>
-        <w:r>
-          <w:rPr>
-            <w:rStyle w:val="Hyperlink"/>
-            <w:b/>
-            <w:bCs/>
-            <w:u w:val="none"/>
-          </w:rPr>
-          <w:t>8</w:t>
-        </w:r>
-        <w:r>
-          <w:rPr>
-            <w:rStyle w:val="Hyperlink"/>
-            <w:b/>
-            <w:bCs/>
-            <w:u w:val="none"/>
-          </w:rPr>
-          <w:t>/06/20/what-happens-if-your-jwt-is-stolen</w:t>
+          <w:t>https://developer.okta.com/blog/2018/06/20/what-happens-if-your-jwt-is-stolen</w:t>
         </w:r>
       </w:hyperlink>
     </w:p>
     <w:p/>
     <w:p>
-      <w:pPr>
-        <w:rPr>
-          <w:b/>
-          <w:bCs/>
-          <w:color w:val="000000" w:themeColor="text1"/>
-          <w:u w:val="dottedHeavy"/>
-        </w:rPr>
-      </w:pPr>
       <w:r>
         <w:t xml:space="preserve">The JWT is actually visible to all and any one decode the payload. But systems ensure that payload doesn’t contain important critical data. It contains just enough info of user for authorization. </w:t>
       </w:r>
       <w:r>
         <w:t>A token’s purpose is to help a server remember who somebody is.</w:t>
+      </w:r>
+    </w:p>
+    <w:p/>
+    <w:p>
+      <w:r>
+        <w:t xml:space="preserve">Verifying JWT </w:t>
+      </w:r>
+      <w:r>
+        <w:br/>
+      </w:r>
+    </w:p>
+    <w:p>
+      <w:r>
+        <w:t xml:space="preserve">Expected Signature = HASH256 </w:t>
+      </w:r>
+      <w:proofErr w:type="gramStart"/>
+      <w:r>
+        <w:t>( base</w:t>
+      </w:r>
+      <w:proofErr w:type="gramEnd"/>
+      <w:r>
+        <w:t xml:space="preserve">64 [header] + base64 [ payload] + </w:t>
+      </w:r>
+      <w:r>
+        <w:t>secret)</w:t>
+      </w:r>
+    </w:p>
+    <w:p>
+      <w:pPr>
+        <w:rPr>
+          <w:rFonts w:asciiTheme="majorHAnsi" w:hAnsiTheme="majorHAnsi" w:cstheme="majorHAnsi"/>
+          <w:color w:val="000000" w:themeColor="text1"/>
+        </w:rPr>
+      </w:pPr>
+      <w:r>
+        <w:rPr>
+          <w:rFonts w:asciiTheme="majorHAnsi" w:hAnsiTheme="majorHAnsi" w:cstheme="majorHAnsi"/>
+          <w:color w:val="000000" w:themeColor="text1"/>
+        </w:rPr>
+        <w:lastRenderedPageBreak/>
+        <w:t>if (</w:t>
+      </w:r>
+      <w:proofErr w:type="gramStart"/>
+      <w:r>
+        <w:rPr>
+          <w:rFonts w:asciiTheme="majorHAnsi" w:hAnsiTheme="majorHAnsi" w:cstheme="majorHAnsi"/>
+          <w:color w:val="000000" w:themeColor="text1"/>
+        </w:rPr>
+        <w:t>expectedSignature</w:t>
+      </w:r>
+      <w:r>
+        <w:rPr>
+          <w:rFonts w:asciiTheme="majorHAnsi" w:hAnsiTheme="majorHAnsi" w:cstheme="majorHAnsi"/>
+          <w:color w:val="000000" w:themeColor="text1"/>
+        </w:rPr>
+        <w:t xml:space="preserve"> </w:t>
+      </w:r>
+      <w:r>
+        <w:rPr>
+          <w:rFonts w:asciiTheme="majorHAnsi" w:hAnsiTheme="majorHAnsi" w:cstheme="majorHAnsi"/>
+          <w:color w:val="000000" w:themeColor="text1"/>
+        </w:rPr>
+        <w:t xml:space="preserve"> ==</w:t>
+      </w:r>
+      <w:r>
+        <w:rPr>
+          <w:rFonts w:asciiTheme="majorHAnsi" w:hAnsiTheme="majorHAnsi" w:cstheme="majorHAnsi"/>
+          <w:color w:val="000000" w:themeColor="text1"/>
+        </w:rPr>
+        <w:t xml:space="preserve"> </w:t>
+      </w:r>
+      <w:r>
+        <w:rPr>
+          <w:rFonts w:asciiTheme="majorHAnsi" w:hAnsiTheme="majorHAnsi" w:cstheme="majorHAnsi"/>
+          <w:color w:val="000000" w:themeColor="text1"/>
+        </w:rPr>
+        <w:t xml:space="preserve"> tokenSignature</w:t>
+      </w:r>
+      <w:proofErr w:type="gramEnd"/>
+      <w:r>
+        <w:rPr>
+          <w:rFonts w:asciiTheme="majorHAnsi" w:hAnsiTheme="majorHAnsi" w:cstheme="majorHAnsi"/>
+          <w:color w:val="000000" w:themeColor="text1"/>
+        </w:rPr>
+        <w:t>)</w:t>
+      </w:r>
+      <w:r>
+        <w:rPr>
+          <w:rFonts w:asciiTheme="majorHAnsi" w:hAnsiTheme="majorHAnsi" w:cstheme="majorHAnsi"/>
+          <w:color w:val="000000" w:themeColor="text1"/>
+        </w:rPr>
+        <w:t xml:space="preserve">   </w:t>
+      </w:r>
+      <w:r>
+        <w:rPr>
+          <w:rFonts w:asciiTheme="majorHAnsi" w:hAnsiTheme="majorHAnsi" w:cstheme="majorHAnsi"/>
+          <w:color w:val="000000" w:themeColor="text1"/>
+        </w:rPr>
+        <w:sym w:font="Wingdings" w:char="F0E8"/>
+      </w:r>
+      <w:r>
+        <w:rPr>
+          <w:rFonts w:asciiTheme="majorHAnsi" w:hAnsiTheme="majorHAnsi" w:cstheme="majorHAnsi"/>
+          <w:color w:val="000000" w:themeColor="text1"/>
+        </w:rPr>
+        <w:t xml:space="preserve"> valid</w:t>
+      </w:r>
+    </w:p>
+    <w:p>
+      <w:pPr>
+        <w:rPr>
+          <w:rFonts w:asciiTheme="majorHAnsi" w:hAnsiTheme="majorHAnsi" w:cstheme="majorHAnsi"/>
+          <w:color w:val="000000" w:themeColor="text1"/>
+        </w:rPr>
+      </w:pPr>
+      <w:r>
+        <w:rPr>
+          <w:rFonts w:asciiTheme="majorHAnsi" w:hAnsiTheme="majorHAnsi" w:cstheme="majorHAnsi"/>
+          <w:color w:val="000000" w:themeColor="text1"/>
+        </w:rPr>
+        <w:t>els</w:t>
+      </w:r>
+      <w:r>
+        <w:rPr>
+          <w:rFonts w:asciiTheme="majorHAnsi" w:hAnsiTheme="majorHAnsi" w:cstheme="majorHAnsi"/>
+          <w:color w:val="000000" w:themeColor="text1"/>
+        </w:rPr>
+        <w:t xml:space="preserve">e  </w:t>
+      </w:r>
+      <w:r>
+        <w:rPr>
+          <w:rFonts w:asciiTheme="majorHAnsi" w:hAnsiTheme="majorHAnsi" w:cstheme="majorHAnsi"/>
+          <w:color w:val="000000" w:themeColor="text1"/>
+        </w:rPr>
+        <w:t xml:space="preserve">  </w:t>
+      </w:r>
+      <w:r>
+        <w:rPr>
+          <w:rFonts w:asciiTheme="majorHAnsi" w:hAnsiTheme="majorHAnsi" w:cstheme="majorHAnsi"/>
+          <w:color w:val="000000" w:themeColor="text1"/>
+        </w:rPr>
+        <w:sym w:font="Wingdings" w:char="F0E8"/>
+      </w:r>
+      <w:r>
+        <w:rPr>
+          <w:rFonts w:asciiTheme="majorHAnsi" w:hAnsiTheme="majorHAnsi" w:cstheme="majorHAnsi"/>
+          <w:color w:val="000000" w:themeColor="text1"/>
+        </w:rPr>
+        <w:t xml:space="preserve"> </w:t>
+      </w:r>
+      <w:r>
+        <w:rPr>
+          <w:rFonts w:ascii="Segoe UI Emoji" w:hAnsi="Segoe UI Emoji" w:cs="Segoe UI Emoji"/>
+          <w:color w:val="000000" w:themeColor="text1"/>
+        </w:rPr>
+        <w:t>❌</w:t>
+      </w:r>
+      <w:r>
+        <w:rPr>
+          <w:rFonts w:asciiTheme="majorHAnsi" w:hAnsiTheme="majorHAnsi" w:cstheme="majorHAnsi"/>
+          <w:color w:val="000000" w:themeColor="text1"/>
+        </w:rPr>
+        <w:t xml:space="preserve"> INVALID</w:t>
       </w:r>
     </w:p>
     <w:p>
@@ -5531,6 +5628,7 @@
         <w:rPr>
           <w:noProof/>
         </w:rPr>
+        <w:lastRenderedPageBreak/>
         <w:drawing>
           <wp:inline distT="0" distB="0" distL="0" distR="0" wp14:anchorId="6DA9CE98" wp14:editId="63737B5D">
             <wp:extent cx="5943600" cy="2945130"/>
@@ -5593,6 +5691,7 @@
         <w:rPr>
           <w:noProof/>
         </w:rPr>
+        <w:lastRenderedPageBreak/>
         <w:drawing>
           <wp:inline distT="0" distB="0" distL="0" distR="0" wp14:anchorId="51D86837" wp14:editId="6C04162A">
             <wp:extent cx="5943600" cy="3090545"/>
@@ -5691,7 +5790,21 @@
             <w:rStyle w:val="Hyperlink"/>
             <w:rFonts w:ascii="Helvetica" w:hAnsi="Helvetica" w:cs="Helvetica"/>
           </w:rPr>
-          <w:t>https://youtu.be/t4-416mg6iU</w:t>
+          <w:t>https://youtu.be/t4-4</w:t>
+        </w:r>
+        <w:r>
+          <w:rPr>
+            <w:rStyle w:val="Hyperlink"/>
+            <w:rFonts w:ascii="Helvetica" w:hAnsi="Helvetica" w:cs="Helvetica"/>
+          </w:rPr>
+          <w:t>1</w:t>
+        </w:r>
+        <w:r>
+          <w:rPr>
+            <w:rStyle w:val="Hyperlink"/>
+            <w:rFonts w:ascii="Helvetica" w:hAnsi="Helvetica" w:cs="Helvetica"/>
+          </w:rPr>
+          <w:t>6mg6iU</w:t>
         </w:r>
       </w:hyperlink>
     </w:p>
@@ -8414,7 +8527,22 @@
       </w:r>
     </w:p>
     <w:p/>
-    <w:p/>
+    <w:p>
+      <w:r>
+        <w:t xml:space="preserve">Have a look at </w:t>
+      </w:r>
+      <w:proofErr w:type="gramStart"/>
+      <w:r>
+        <w:t>it :</w:t>
+      </w:r>
+      <w:proofErr w:type="gramEnd"/>
+      <w:r>
+        <w:t xml:space="preserve">  </w:t>
+      </w:r>
+      <w:r>
+        <w:t>https://developer.okta.com/blog/2019/10/21/illustrated-guide-to-oauth-and-oidc</w:t>
+      </w:r>
+    </w:p>
     <w:tbl>
       <w:tblPr>
         <w:tblW w:w="4917" w:type="dxa"/>
@@ -9715,6 +9843,7 @@
   <w:style w:type="character" w:default="1" w:styleId="DefaultParagraphFont">
     <w:name w:val="Default Paragraph Font"/>
     <w:uiPriority w:val="1"/>
+    <w:semiHidden/>
     <w:unhideWhenUsed/>
   </w:style>
   <w:style w:type="table" w:default="1" w:styleId="TableNormal">

</xml_diff>